<commit_message>
done for training model
</commit_message>
<xml_diff>
--- a/report1-List dataset explore.docx
+++ b/report1-List dataset explore.docx
@@ -9552,17 +9552,19 @@
           <w:szCs w:val="24"/>
           <w:lang w:val="en-US"/>
         </w:rPr>
-        <w:t>train = 112 x 28 / masing" kelas</w:t>
-      </w:r>
-      <w:r>
+        <w:t>train = 112 x 28 / masing" kelas = 3,136</w:t>
+      </w:r>
+    </w:p>
+    <w:p>
+      <w:pPr>
+        <w:spacing w:line="240" w:lineRule="auto"/>
         <w:rPr>
           <w:rFonts w:ascii="Times New Roman" w:hAnsi="Times New Roman" w:cs="Times New Roman"/>
           <w:sz w:val="24"/>
           <w:szCs w:val="24"/>
           <w:lang w:val="en-US"/>
         </w:rPr>
-        <w:t xml:space="preserve"> = </w:t>
-      </w:r>
+      </w:pPr>
       <w:r>
         <w:rPr>
           <w:rFonts w:ascii="Times New Roman" w:hAnsi="Times New Roman" w:cs="Times New Roman"/>
@@ -9570,7 +9572,7 @@
           <w:szCs w:val="24"/>
           <w:lang w:val="en-US"/>
         </w:rPr>
-        <w:t>3,136</w:t>
+        <w:t>val = 112 x 6 / masing" kelas = 672</w:t>
       </w:r>
     </w:p>
     <w:p>
@@ -9590,17 +9592,19 @@
           <w:szCs w:val="24"/>
           <w:lang w:val="en-US"/>
         </w:rPr>
-        <w:t>val = 112 x 6 / masing" kelas</w:t>
-      </w:r>
-      <w:r>
+        <w:t>test = 112 x 6 / masing" kelas = 672</w:t>
+      </w:r>
+    </w:p>
+    <w:p>
+      <w:pPr>
+        <w:spacing w:line="240" w:lineRule="auto"/>
         <w:rPr>
           <w:rFonts w:ascii="Times New Roman" w:hAnsi="Times New Roman" w:cs="Times New Roman"/>
           <w:sz w:val="24"/>
           <w:szCs w:val="24"/>
           <w:lang w:val="en-US"/>
         </w:rPr>
-        <w:t xml:space="preserve"> = </w:t>
-      </w:r>
+      </w:pPr>
       <w:r>
         <w:rPr>
           <w:rFonts w:ascii="Times New Roman" w:hAnsi="Times New Roman" w:cs="Times New Roman"/>
@@ -9608,128 +9612,7 @@
           <w:szCs w:val="24"/>
           <w:lang w:val="en-US"/>
         </w:rPr>
-        <w:t>672</w:t>
-      </w:r>
-    </w:p>
-    <w:p>
-      <w:pPr>
-        <w:spacing w:line="240" w:lineRule="auto"/>
-        <w:rPr>
-          <w:rFonts w:ascii="Times New Roman" w:hAnsi="Times New Roman" w:cs="Times New Roman"/>
-          <w:sz w:val="24"/>
-          <w:szCs w:val="24"/>
-          <w:lang w:val="en-US"/>
-        </w:rPr>
-      </w:pPr>
-      <w:r>
-        <w:rPr>
-          <w:rFonts w:ascii="Times New Roman" w:hAnsi="Times New Roman" w:cs="Times New Roman"/>
-          <w:sz w:val="24"/>
-          <w:szCs w:val="24"/>
-          <w:lang w:val="en-US"/>
-        </w:rPr>
-        <w:t>test = 112 x 6 / masing" kelas</w:t>
-      </w:r>
-      <w:r>
-        <w:rPr>
-          <w:rFonts w:ascii="Times New Roman" w:hAnsi="Times New Roman" w:cs="Times New Roman"/>
-          <w:sz w:val="24"/>
-          <w:szCs w:val="24"/>
-          <w:lang w:val="en-US"/>
-        </w:rPr>
-        <w:t xml:space="preserve"> = </w:t>
-      </w:r>
-      <w:r>
-        <w:rPr>
-          <w:rFonts w:ascii="Times New Roman" w:hAnsi="Times New Roman" w:cs="Times New Roman"/>
-          <w:sz w:val="24"/>
-          <w:szCs w:val="24"/>
-          <w:lang w:val="en-US"/>
-        </w:rPr>
-        <w:t>672</w:t>
-      </w:r>
-    </w:p>
-    <w:p>
-      <w:pPr>
-        <w:spacing w:line="240" w:lineRule="auto"/>
-        <w:rPr>
-          <w:rFonts w:ascii="Times New Roman" w:hAnsi="Times New Roman" w:cs="Times New Roman"/>
-          <w:sz w:val="24"/>
-          <w:szCs w:val="24"/>
-          <w:lang w:val="en-US"/>
-        </w:rPr>
-      </w:pPr>
-      <w:r>
-        <w:rPr>
-          <w:rFonts w:ascii="Times New Roman" w:hAnsi="Times New Roman" w:cs="Times New Roman"/>
-          <w:sz w:val="24"/>
-          <w:szCs w:val="24"/>
-          <w:lang w:val="en-US"/>
-        </w:rPr>
-        <w:t xml:space="preserve">total = </w:t>
-      </w:r>
-      <w:r>
-        <w:rPr>
-          <w:rFonts w:ascii="Times New Roman" w:hAnsi="Times New Roman" w:cs="Times New Roman"/>
-          <w:sz w:val="24"/>
-          <w:szCs w:val="24"/>
-          <w:lang w:val="en-US"/>
-        </w:rPr>
-        <w:t>3,136</w:t>
-      </w:r>
-      <w:r>
-        <w:rPr>
-          <w:rFonts w:ascii="Times New Roman" w:hAnsi="Times New Roman" w:cs="Times New Roman"/>
-          <w:sz w:val="24"/>
-          <w:szCs w:val="24"/>
-          <w:lang w:val="en-US"/>
-        </w:rPr>
-        <w:t xml:space="preserve"> + </w:t>
-      </w:r>
-      <w:r>
-        <w:rPr>
-          <w:rFonts w:ascii="Times New Roman" w:hAnsi="Times New Roman" w:cs="Times New Roman"/>
-          <w:sz w:val="24"/>
-          <w:szCs w:val="24"/>
-          <w:lang w:val="en-US"/>
-        </w:rPr>
-        <w:t>672</w:t>
-      </w:r>
-      <w:r>
-        <w:rPr>
-          <w:rFonts w:ascii="Times New Roman" w:hAnsi="Times New Roman" w:cs="Times New Roman"/>
-          <w:sz w:val="24"/>
-          <w:szCs w:val="24"/>
-          <w:lang w:val="en-US"/>
-        </w:rPr>
-        <w:t xml:space="preserve"> + </w:t>
-      </w:r>
-      <w:r>
-        <w:rPr>
-          <w:rFonts w:ascii="Times New Roman" w:hAnsi="Times New Roman" w:cs="Times New Roman"/>
-          <w:sz w:val="24"/>
-          <w:szCs w:val="24"/>
-          <w:lang w:val="en-US"/>
-        </w:rPr>
-        <w:t>672</w:t>
-      </w:r>
-      <w:r>
-        <w:rPr>
-          <w:rFonts w:ascii="Times New Roman" w:hAnsi="Times New Roman" w:cs="Times New Roman"/>
-          <w:sz w:val="24"/>
-          <w:szCs w:val="24"/>
-          <w:lang w:val="en-US"/>
-        </w:rPr>
-        <w:t xml:space="preserve"> = </w:t>
-      </w:r>
-      <w:r>
-        <w:rPr>
-          <w:rFonts w:ascii="Times New Roman" w:hAnsi="Times New Roman" w:cs="Times New Roman"/>
-          <w:sz w:val="24"/>
-          <w:szCs w:val="24"/>
-          <w:lang w:val="en-US"/>
-        </w:rPr>
-        <w:t>4,480</w:t>
+        <w:t>total = 3,136 + 672 + 672 = 4,480</w:t>
       </w:r>
     </w:p>
     <w:p>
@@ -9871,29 +9754,7 @@
           <w:szCs w:val="24"/>
           <w:lang w:val="en-US"/>
         </w:rPr>
-        <w:t>toalnya = 196</w:t>
-      </w:r>
-      <w:r>
-        <w:rPr>
-          <w:rFonts w:ascii="Times New Roman" w:hAnsi="Times New Roman" w:cs="Times New Roman"/>
-          <w:b/>
-          <w:bCs/>
-          <w:sz w:val="24"/>
-          <w:szCs w:val="24"/>
-          <w:lang w:val="en-US"/>
-        </w:rPr>
-        <w:t xml:space="preserve"> + 42 + 42 = </w:t>
-      </w:r>
-      <w:r>
-        <w:rPr>
-          <w:rFonts w:ascii="Times New Roman" w:hAnsi="Times New Roman" w:cs="Times New Roman"/>
-          <w:b/>
-          <w:bCs/>
-          <w:sz w:val="24"/>
-          <w:szCs w:val="24"/>
-          <w:lang w:val="en-US"/>
-        </w:rPr>
-        <w:t>280</w:t>
+        <w:t>toalnya = 196 + 42 + 42 = 280</w:t>
       </w:r>
     </w:p>
     <w:p>
@@ -9942,7 +9803,27 @@
           <w:lang w:val="en-US"/>
         </w:rPr>
         <w:lastRenderedPageBreak/>
-        <w:t>DATASET REQUEST X TERSEDIA</w:t>
+        <w:t xml:space="preserve">DATASET REQUEST </w:t>
+      </w:r>
+      <w:r>
+        <w:rPr>
+          <w:rFonts w:ascii="Times New Roman" w:hAnsi="Times New Roman" w:cs="Times New Roman"/>
+          <w:color w:val="auto"/>
+          <w:sz w:val="20"/>
+          <w:szCs w:val="20"/>
+          <w:lang w:val="en-US"/>
+        </w:rPr>
+        <w:t>DI SKRIPSI VS DATA YANG</w:t>
+      </w:r>
+      <w:r>
+        <w:rPr>
+          <w:rFonts w:ascii="Times New Roman" w:hAnsi="Times New Roman" w:cs="Times New Roman"/>
+          <w:color w:val="auto"/>
+          <w:sz w:val="20"/>
+          <w:szCs w:val="20"/>
+          <w:lang w:val="en-US"/>
+        </w:rPr>
+        <w:t xml:space="preserve"> TERSEDIA</w:t>
       </w:r>
     </w:p>
     <w:tbl>
@@ -10704,6 +10585,16 @@
         </w:rPr>
         <w:t xml:space="preserve">SARAN PENELITIAN </w:t>
       </w:r>
+      <w:r>
+        <w:rPr>
+          <w:rFonts w:ascii="Times New Roman" w:hAnsi="Times New Roman" w:cs="Times New Roman"/>
+          <w:color w:val="auto"/>
+          <w:sz w:val="20"/>
+          <w:szCs w:val="20"/>
+          <w:lang w:val="en-US"/>
+        </w:rPr>
+        <w:t>(SUDAH DI KONFIRMASI OLEH DOSEN)</w:t>
+      </w:r>
     </w:p>
     <w:p>
       <w:pPr>
@@ -10728,18 +10619,25 @@
     <w:tbl>
       <w:tblPr>
         <w:tblStyle w:val="TableGrid"/>
-        <w:tblW w:w="0" w:type="auto"/>
+        <w:tblW w:w="9476" w:type="dxa"/>
+        <w:tblLayout w:type="fixed"/>
         <w:tblLook w:val="04A0" w:firstRow="1" w:lastRow="0" w:firstColumn="1" w:lastColumn="0" w:noHBand="0" w:noVBand="1"/>
       </w:tblPr>
       <w:tblGrid>
         <w:gridCol w:w="461"/>
-        <w:gridCol w:w="3220"/>
-        <w:gridCol w:w="5528"/>
+        <w:gridCol w:w="1094"/>
+        <w:gridCol w:w="1701"/>
+        <w:gridCol w:w="894"/>
+        <w:gridCol w:w="807"/>
+        <w:gridCol w:w="928"/>
+        <w:gridCol w:w="961"/>
+        <w:gridCol w:w="1355"/>
+        <w:gridCol w:w="1275"/>
       </w:tblGrid>
       <w:tr>
         <w:tc>
           <w:tcPr>
-            <w:tcW w:w="0" w:type="auto"/>
+            <w:tcW w:w="461" w:type="dxa"/>
             <w:hideMark/>
           </w:tcPr>
           <w:p>
@@ -10769,7 +10667,7 @@
         </w:tc>
         <w:tc>
           <w:tcPr>
-            <w:tcW w:w="3220" w:type="dxa"/>
+            <w:tcW w:w="1094" w:type="dxa"/>
             <w:hideMark/>
           </w:tcPr>
           <w:p>
@@ -10793,13 +10691,13 @@
                 <w:szCs w:val="20"/>
                 <w:lang w:val="en-US"/>
               </w:rPr>
-              <w:t>Kelas Penelitian</w:t>
+              <w:t>Nama Obat Penelitian</w:t>
             </w:r>
           </w:p>
         </w:tc>
         <w:tc>
           <w:tcPr>
-            <w:tcW w:w="5528" w:type="dxa"/>
+            <w:tcW w:w="1701" w:type="dxa"/>
             <w:hideMark/>
           </w:tcPr>
           <w:p>
@@ -10823,7 +10721,187 @@
                 <w:szCs w:val="20"/>
                 <w:lang w:val="en-US"/>
               </w:rPr>
-              <w:t>Nama Dataset</w:t>
+              <w:t>Fungsi Utama</w:t>
+            </w:r>
+          </w:p>
+        </w:tc>
+        <w:tc>
+          <w:tcPr>
+            <w:tcW w:w="894" w:type="dxa"/>
+            <w:hideMark/>
+          </w:tcPr>
+          <w:p>
+            <w:pPr>
+              <w:spacing w:after="160"/>
+              <w:rPr>
+                <w:rFonts w:ascii="Times New Roman" w:hAnsi="Times New Roman" w:cs="Times New Roman"/>
+                <w:b/>
+                <w:bCs/>
+                <w:sz w:val="20"/>
+                <w:szCs w:val="20"/>
+                <w:lang w:val="en-US"/>
+              </w:rPr>
+            </w:pPr>
+            <w:r>
+              <w:rPr>
+                <w:rFonts w:ascii="Times New Roman" w:hAnsi="Times New Roman" w:cs="Times New Roman"/>
+                <w:b/>
+                <w:bCs/>
+                <w:sz w:val="20"/>
+                <w:szCs w:val="20"/>
+                <w:lang w:val="en-US"/>
+              </w:rPr>
+              <w:t>Bentuk Tablet</w:t>
+            </w:r>
+          </w:p>
+        </w:tc>
+        <w:tc>
+          <w:tcPr>
+            <w:tcW w:w="807" w:type="dxa"/>
+            <w:hideMark/>
+          </w:tcPr>
+          <w:p>
+            <w:pPr>
+              <w:spacing w:after="160"/>
+              <w:rPr>
+                <w:rFonts w:ascii="Times New Roman" w:hAnsi="Times New Roman" w:cs="Times New Roman"/>
+                <w:b/>
+                <w:bCs/>
+                <w:sz w:val="20"/>
+                <w:szCs w:val="20"/>
+                <w:lang w:val="en-US"/>
+              </w:rPr>
+            </w:pPr>
+            <w:r>
+              <w:rPr>
+                <w:rFonts w:ascii="Times New Roman" w:hAnsi="Times New Roman" w:cs="Times New Roman"/>
+                <w:b/>
+                <w:bCs/>
+                <w:sz w:val="20"/>
+                <w:szCs w:val="20"/>
+                <w:lang w:val="en-US"/>
+              </w:rPr>
+              <w:t>Warna</w:t>
+            </w:r>
+          </w:p>
+        </w:tc>
+        <w:tc>
+          <w:tcPr>
+            <w:tcW w:w="928" w:type="dxa"/>
+            <w:hideMark/>
+          </w:tcPr>
+          <w:p>
+            <w:pPr>
+              <w:spacing w:after="160"/>
+              <w:rPr>
+                <w:rFonts w:ascii="Times New Roman" w:hAnsi="Times New Roman" w:cs="Times New Roman"/>
+                <w:b/>
+                <w:bCs/>
+                <w:sz w:val="20"/>
+                <w:szCs w:val="20"/>
+                <w:lang w:val="en-US"/>
+              </w:rPr>
+            </w:pPr>
+            <w:r>
+              <w:rPr>
+                <w:rFonts w:ascii="Times New Roman" w:hAnsi="Times New Roman" w:cs="Times New Roman"/>
+                <w:b/>
+                <w:bCs/>
+                <w:sz w:val="20"/>
+                <w:szCs w:val="20"/>
+                <w:lang w:val="en-US"/>
+              </w:rPr>
+              <w:t>Imprint</w:t>
+            </w:r>
+          </w:p>
+        </w:tc>
+        <w:tc>
+          <w:tcPr>
+            <w:tcW w:w="961" w:type="dxa"/>
+            <w:hideMark/>
+          </w:tcPr>
+          <w:p>
+            <w:pPr>
+              <w:spacing w:after="160"/>
+              <w:rPr>
+                <w:rFonts w:ascii="Times New Roman" w:hAnsi="Times New Roman" w:cs="Times New Roman"/>
+                <w:b/>
+                <w:bCs/>
+                <w:sz w:val="20"/>
+                <w:szCs w:val="20"/>
+                <w:lang w:val="en-US"/>
+              </w:rPr>
+            </w:pPr>
+            <w:r>
+              <w:rPr>
+                <w:rFonts w:ascii="Times New Roman" w:hAnsi="Times New Roman" w:cs="Times New Roman"/>
+                <w:b/>
+                <w:bCs/>
+                <w:sz w:val="20"/>
+                <w:szCs w:val="20"/>
+                <w:lang w:val="en-US"/>
+              </w:rPr>
+              <w:t>Ada di Dataset?</w:t>
+            </w:r>
+          </w:p>
+        </w:tc>
+        <w:tc>
+          <w:tcPr>
+            <w:tcW w:w="1355" w:type="dxa"/>
+            <w:hideMark/>
+          </w:tcPr>
+          <w:p>
+            <w:pPr>
+              <w:spacing w:after="160"/>
+              <w:rPr>
+                <w:rFonts w:ascii="Times New Roman" w:hAnsi="Times New Roman" w:cs="Times New Roman"/>
+                <w:b/>
+                <w:bCs/>
+                <w:sz w:val="20"/>
+                <w:szCs w:val="20"/>
+                <w:lang w:val="en-US"/>
+              </w:rPr>
+            </w:pPr>
+            <w:r>
+              <w:rPr>
+                <w:rFonts w:ascii="Times New Roman" w:hAnsi="Times New Roman" w:cs="Times New Roman"/>
+                <w:b/>
+                <w:bCs/>
+                <w:sz w:val="20"/>
+                <w:szCs w:val="20"/>
+                <w:lang w:val="en-US"/>
+              </w:rPr>
+              <w:t>Nama Kelas di Dataset</w:t>
+            </w:r>
+          </w:p>
+        </w:tc>
+        <w:tc>
+          <w:tcPr>
+            <w:tcW w:w="1275" w:type="dxa"/>
+            <w:hideMark/>
+          </w:tcPr>
+          <w:p>
+            <w:pPr>
+              <w:spacing w:after="160"/>
+              <w:rPr>
+                <w:rFonts w:ascii="Times New Roman" w:hAnsi="Times New Roman" w:cs="Times New Roman"/>
+                <w:b/>
+                <w:bCs/>
+                <w:sz w:val="20"/>
+                <w:szCs w:val="20"/>
+                <w:lang w:val="en-US"/>
+              </w:rPr>
+            </w:pPr>
+            <w:r>
+              <w:rPr>
+                <w:rFonts w:ascii="Times New Roman" w:hAnsi="Times New Roman" w:cs="Times New Roman"/>
+                <w:b/>
+                <w:bCs/>
+                <w:sz w:val="20"/>
+                <w:szCs w:val="20"/>
+                <w:lang w:val="en-US"/>
+              </w:rPr>
+              <w:t>Keterangan</w:t>
             </w:r>
           </w:p>
         </w:tc>
@@ -10831,7 +10909,7 @@
       <w:tr>
         <w:tc>
           <w:tcPr>
-            <w:tcW w:w="0" w:type="auto"/>
+            <w:tcW w:w="461" w:type="dxa"/>
             <w:hideMark/>
           </w:tcPr>
           <w:p>
@@ -10857,7 +10935,7 @@
         </w:tc>
         <w:tc>
           <w:tcPr>
-            <w:tcW w:w="3220" w:type="dxa"/>
+            <w:tcW w:w="1094" w:type="dxa"/>
             <w:hideMark/>
           </w:tcPr>
           <w:p>
@@ -10883,7 +10961,7 @@
         </w:tc>
         <w:tc>
           <w:tcPr>
-            <w:tcW w:w="5528" w:type="dxa"/>
+            <w:tcW w:w="1701" w:type="dxa"/>
             <w:hideMark/>
           </w:tcPr>
           <w:p>
@@ -10903,7 +10981,172 @@
                 <w:szCs w:val="20"/>
                 <w:lang w:val="en-US"/>
               </w:rPr>
-              <w:t>cataflam_50_mg</w:t>
+              <w:t>Anti-nyeri dan anti-inflamasi (NSAID) untuk mengatasi nyeri, peradangan, nyeri sendi, sakit gigi, dan nyeri otot</w:t>
+            </w:r>
+          </w:p>
+        </w:tc>
+        <w:tc>
+          <w:tcPr>
+            <w:tcW w:w="894" w:type="dxa"/>
+            <w:hideMark/>
+          </w:tcPr>
+          <w:p>
+            <w:pPr>
+              <w:spacing w:after="160"/>
+              <w:rPr>
+                <w:rFonts w:ascii="Times New Roman" w:hAnsi="Times New Roman" w:cs="Times New Roman"/>
+                <w:sz w:val="20"/>
+                <w:szCs w:val="20"/>
+                <w:lang w:val="en-US"/>
+              </w:rPr>
+            </w:pPr>
+            <w:r>
+              <w:rPr>
+                <w:rFonts w:ascii="Times New Roman" w:hAnsi="Times New Roman" w:cs="Times New Roman"/>
+                <w:sz w:val="20"/>
+                <w:szCs w:val="20"/>
+                <w:lang w:val="en-US"/>
+              </w:rPr>
+              <w:t>Bulat</w:t>
+            </w:r>
+          </w:p>
+        </w:tc>
+        <w:tc>
+          <w:tcPr>
+            <w:tcW w:w="807" w:type="dxa"/>
+            <w:hideMark/>
+          </w:tcPr>
+          <w:p>
+            <w:pPr>
+              <w:spacing w:after="160"/>
+              <w:rPr>
+                <w:rFonts w:ascii="Times New Roman" w:hAnsi="Times New Roman" w:cs="Times New Roman"/>
+                <w:sz w:val="20"/>
+                <w:szCs w:val="20"/>
+                <w:lang w:val="en-US"/>
+              </w:rPr>
+            </w:pPr>
+            <w:r>
+              <w:rPr>
+                <w:rFonts w:ascii="Times New Roman" w:hAnsi="Times New Roman" w:cs="Times New Roman"/>
+                <w:sz w:val="20"/>
+                <w:szCs w:val="20"/>
+                <w:lang w:val="en-US"/>
+              </w:rPr>
+              <w:t>Merah muda/merah</w:t>
+            </w:r>
+          </w:p>
+        </w:tc>
+        <w:tc>
+          <w:tcPr>
+            <w:tcW w:w="928" w:type="dxa"/>
+            <w:hideMark/>
+          </w:tcPr>
+          <w:p>
+            <w:pPr>
+              <w:spacing w:after="160"/>
+              <w:rPr>
+                <w:rFonts w:ascii="Times New Roman" w:hAnsi="Times New Roman" w:cs="Times New Roman"/>
+                <w:sz w:val="20"/>
+                <w:szCs w:val="20"/>
+                <w:lang w:val="en-US"/>
+              </w:rPr>
+            </w:pPr>
+            <w:r>
+              <w:rPr>
+                <w:rFonts w:ascii="Times New Roman" w:hAnsi="Times New Roman" w:cs="Times New Roman"/>
+                <w:sz w:val="20"/>
+                <w:szCs w:val="20"/>
+                <w:lang w:val="en-US"/>
+              </w:rPr>
+              <w:t>Polos</w:t>
+            </w:r>
+          </w:p>
+        </w:tc>
+        <w:tc>
+          <w:tcPr>
+            <w:tcW w:w="961" w:type="dxa"/>
+            <w:hideMark/>
+          </w:tcPr>
+          <w:p>
+            <w:pPr>
+              <w:spacing w:after="160"/>
+              <w:rPr>
+                <w:rFonts w:ascii="Times New Roman" w:hAnsi="Times New Roman" w:cs="Times New Roman"/>
+                <w:sz w:val="20"/>
+                <w:szCs w:val="20"/>
+                <w:lang w:val="en-US"/>
+              </w:rPr>
+            </w:pPr>
+            <w:r>
+              <w:rPr>
+                <w:rFonts w:ascii="Segoe UI Emoji" w:hAnsi="Segoe UI Emoji" w:cs="Segoe UI Emoji"/>
+                <w:sz w:val="20"/>
+                <w:szCs w:val="20"/>
+                <w:lang w:val="en-US"/>
+              </w:rPr>
+              <w:t>✅</w:t>
+            </w:r>
+            <w:r>
+              <w:rPr>
+                <w:rFonts w:ascii="Times New Roman" w:hAnsi="Times New Roman" w:cs="Times New Roman"/>
+                <w:sz w:val="20"/>
+                <w:szCs w:val="20"/>
+                <w:lang w:val="en-US"/>
+              </w:rPr>
+              <w:t xml:space="preserve"> Ada</w:t>
+            </w:r>
+          </w:p>
+        </w:tc>
+        <w:tc>
+          <w:tcPr>
+            <w:tcW w:w="1355" w:type="dxa"/>
+            <w:hideMark/>
+          </w:tcPr>
+          <w:p>
+            <w:pPr>
+              <w:spacing w:after="160"/>
+              <w:rPr>
+                <w:rFonts w:ascii="Times New Roman" w:hAnsi="Times New Roman" w:cs="Times New Roman"/>
+                <w:sz w:val="20"/>
+                <w:szCs w:val="20"/>
+                <w:lang w:val="en-US"/>
+              </w:rPr>
+            </w:pPr>
+            <w:r>
+              <w:rPr>
+                <w:rFonts w:ascii="Times New Roman" w:hAnsi="Times New Roman" w:cs="Times New Roman"/>
+                <w:sz w:val="20"/>
+                <w:szCs w:val="20"/>
+                <w:lang w:val="en-US"/>
+              </w:rPr>
+              <w:t>cataflam_50_mgcataflam_dolo_25_mgcataflam_v_50_mg</w:t>
+            </w:r>
+          </w:p>
+        </w:tc>
+        <w:tc>
+          <w:tcPr>
+            <w:tcW w:w="1275" w:type="dxa"/>
+            <w:hideMark/>
+          </w:tcPr>
+          <w:p>
+            <w:pPr>
+              <w:spacing w:after="160"/>
+              <w:rPr>
+                <w:rFonts w:ascii="Times New Roman" w:hAnsi="Times New Roman" w:cs="Times New Roman"/>
+                <w:sz w:val="20"/>
+                <w:szCs w:val="20"/>
+                <w:lang w:val="en-US"/>
+              </w:rPr>
+            </w:pPr>
+            <w:r>
+              <w:rPr>
+                <w:rFonts w:ascii="Times New Roman" w:hAnsi="Times New Roman" w:cs="Times New Roman"/>
+                <w:sz w:val="20"/>
+                <w:szCs w:val="20"/>
+                <w:lang w:val="en-US"/>
+              </w:rPr>
+              <w:t>Bisa dipakai</w:t>
             </w:r>
           </w:p>
         </w:tc>
@@ -10911,7 +11154,7 @@
       <w:tr>
         <w:tc>
           <w:tcPr>
-            <w:tcW w:w="0" w:type="auto"/>
+            <w:tcW w:w="461" w:type="dxa"/>
             <w:hideMark/>
           </w:tcPr>
           <w:p>
@@ -10937,7 +11180,7 @@
         </w:tc>
         <w:tc>
           <w:tcPr>
-            <w:tcW w:w="3220" w:type="dxa"/>
+            <w:tcW w:w="1094" w:type="dxa"/>
             <w:hideMark/>
           </w:tcPr>
           <w:p>
@@ -10963,7 +11206,7 @@
         </w:tc>
         <w:tc>
           <w:tcPr>
-            <w:tcW w:w="5528" w:type="dxa"/>
+            <w:tcW w:w="1701" w:type="dxa"/>
             <w:hideMark/>
           </w:tcPr>
           <w:p>
@@ -10983,7 +11226,172 @@
                 <w:szCs w:val="20"/>
                 <w:lang w:val="en-US"/>
               </w:rPr>
+              <w:t>Antihistamin untuk mengatasi alergi, gatal-gatal, biduran, dan gejala rhinitis alergi</w:t>
+            </w:r>
+          </w:p>
+        </w:tc>
+        <w:tc>
+          <w:tcPr>
+            <w:tcW w:w="894" w:type="dxa"/>
+            <w:hideMark/>
+          </w:tcPr>
+          <w:p>
+            <w:pPr>
+              <w:spacing w:after="160"/>
+              <w:rPr>
+                <w:rFonts w:ascii="Times New Roman" w:hAnsi="Times New Roman" w:cs="Times New Roman"/>
+                <w:sz w:val="20"/>
+                <w:szCs w:val="20"/>
+                <w:lang w:val="en-US"/>
+              </w:rPr>
+            </w:pPr>
+            <w:r>
+              <w:rPr>
+                <w:rFonts w:ascii="Times New Roman" w:hAnsi="Times New Roman" w:cs="Times New Roman"/>
+                <w:sz w:val="20"/>
+                <w:szCs w:val="20"/>
+                <w:lang w:val="en-US"/>
+              </w:rPr>
+              <w:t>Lonjong</w:t>
+            </w:r>
+          </w:p>
+        </w:tc>
+        <w:tc>
+          <w:tcPr>
+            <w:tcW w:w="807" w:type="dxa"/>
+            <w:hideMark/>
+          </w:tcPr>
+          <w:p>
+            <w:pPr>
+              <w:spacing w:after="160"/>
+              <w:rPr>
+                <w:rFonts w:ascii="Times New Roman" w:hAnsi="Times New Roman" w:cs="Times New Roman"/>
+                <w:sz w:val="20"/>
+                <w:szCs w:val="20"/>
+                <w:lang w:val="en-US"/>
+              </w:rPr>
+            </w:pPr>
+            <w:r>
+              <w:rPr>
+                <w:rFonts w:ascii="Times New Roman" w:hAnsi="Times New Roman" w:cs="Times New Roman"/>
+                <w:sz w:val="20"/>
+                <w:szCs w:val="20"/>
+                <w:lang w:val="en-US"/>
+              </w:rPr>
+              <w:t>Putih</w:t>
+            </w:r>
+          </w:p>
+        </w:tc>
+        <w:tc>
+          <w:tcPr>
+            <w:tcW w:w="928" w:type="dxa"/>
+            <w:hideMark/>
+          </w:tcPr>
+          <w:p>
+            <w:pPr>
+              <w:spacing w:after="160"/>
+              <w:rPr>
+                <w:rFonts w:ascii="Times New Roman" w:hAnsi="Times New Roman" w:cs="Times New Roman"/>
+                <w:sz w:val="20"/>
+                <w:szCs w:val="20"/>
+                <w:lang w:val="en-US"/>
+              </w:rPr>
+            </w:pPr>
+            <w:r>
+              <w:rPr>
+                <w:rFonts w:ascii="Times New Roman" w:hAnsi="Times New Roman" w:cs="Times New Roman"/>
+                <w:sz w:val="20"/>
+                <w:szCs w:val="20"/>
+                <w:lang w:val="en-US"/>
+              </w:rPr>
+              <w:t>Bergaris</w:t>
+            </w:r>
+          </w:p>
+        </w:tc>
+        <w:tc>
+          <w:tcPr>
+            <w:tcW w:w="961" w:type="dxa"/>
+            <w:hideMark/>
+          </w:tcPr>
+          <w:p>
+            <w:pPr>
+              <w:spacing w:after="160"/>
+              <w:rPr>
+                <w:rFonts w:ascii="Times New Roman" w:hAnsi="Times New Roman" w:cs="Times New Roman"/>
+                <w:sz w:val="20"/>
+                <w:szCs w:val="20"/>
+                <w:lang w:val="en-US"/>
+              </w:rPr>
+            </w:pPr>
+            <w:r>
+              <w:rPr>
+                <w:rFonts w:ascii="Segoe UI Emoji" w:hAnsi="Segoe UI Emoji" w:cs="Segoe UI Emoji"/>
+                <w:sz w:val="20"/>
+                <w:szCs w:val="20"/>
+                <w:lang w:val="en-US"/>
+              </w:rPr>
+              <w:t>✅</w:t>
+            </w:r>
+            <w:r>
+              <w:rPr>
+                <w:rFonts w:ascii="Times New Roman" w:hAnsi="Times New Roman" w:cs="Times New Roman"/>
+                <w:sz w:val="20"/>
+                <w:szCs w:val="20"/>
+                <w:lang w:val="en-US"/>
+              </w:rPr>
+              <w:t xml:space="preserve"> Ada</w:t>
+            </w:r>
+          </w:p>
+        </w:tc>
+        <w:tc>
+          <w:tcPr>
+            <w:tcW w:w="1355" w:type="dxa"/>
+            <w:hideMark/>
+          </w:tcPr>
+          <w:p>
+            <w:pPr>
+              <w:spacing w:after="160"/>
+              <w:rPr>
+                <w:rFonts w:ascii="Times New Roman" w:hAnsi="Times New Roman" w:cs="Times New Roman"/>
+                <w:sz w:val="20"/>
+                <w:szCs w:val="20"/>
+                <w:lang w:val="en-US"/>
+              </w:rPr>
+            </w:pPr>
+            <w:r>
+              <w:rPr>
+                <w:rFonts w:ascii="Times New Roman" w:hAnsi="Times New Roman" w:cs="Times New Roman"/>
+                <w:sz w:val="20"/>
+                <w:szCs w:val="20"/>
+                <w:lang w:val="en-US"/>
+              </w:rPr>
               <w:t>cetirizin_10_mg</w:t>
+            </w:r>
+          </w:p>
+        </w:tc>
+        <w:tc>
+          <w:tcPr>
+            <w:tcW w:w="1275" w:type="dxa"/>
+            <w:hideMark/>
+          </w:tcPr>
+          <w:p>
+            <w:pPr>
+              <w:spacing w:after="160"/>
+              <w:rPr>
+                <w:rFonts w:ascii="Times New Roman" w:hAnsi="Times New Roman" w:cs="Times New Roman"/>
+                <w:sz w:val="20"/>
+                <w:szCs w:val="20"/>
+                <w:lang w:val="en-US"/>
+              </w:rPr>
+            </w:pPr>
+            <w:r>
+              <w:rPr>
+                <w:rFonts w:ascii="Times New Roman" w:hAnsi="Times New Roman" w:cs="Times New Roman"/>
+                <w:sz w:val="20"/>
+                <w:szCs w:val="20"/>
+                <w:lang w:val="en-US"/>
+              </w:rPr>
+              <w:t>Bisa dipakai</w:t>
             </w:r>
           </w:p>
         </w:tc>
@@ -10991,7 +11399,7 @@
       <w:tr>
         <w:tc>
           <w:tcPr>
-            <w:tcW w:w="0" w:type="auto"/>
+            <w:tcW w:w="461" w:type="dxa"/>
             <w:hideMark/>
           </w:tcPr>
           <w:p>
@@ -11017,7 +11425,7 @@
         </w:tc>
         <w:tc>
           <w:tcPr>
-            <w:tcW w:w="3220" w:type="dxa"/>
+            <w:tcW w:w="1094" w:type="dxa"/>
             <w:hideMark/>
           </w:tcPr>
           <w:p>
@@ -11037,13 +11445,13 @@
                 <w:szCs w:val="20"/>
                 <w:lang w:val="en-US"/>
               </w:rPr>
-              <w:t>Paracetamol</w:t>
+              <w:t>Pantoprazol Sandoz 40 mg</w:t>
             </w:r>
           </w:p>
         </w:tc>
         <w:tc>
           <w:tcPr>
-            <w:tcW w:w="5528" w:type="dxa"/>
+            <w:tcW w:w="1701" w:type="dxa"/>
             <w:hideMark/>
           </w:tcPr>
           <w:p>
@@ -11063,7 +11471,172 @@
                 <w:szCs w:val="20"/>
                 <w:lang w:val="en-US"/>
               </w:rPr>
-              <w:t>rubophen_500_mg</w:t>
+              <w:t>Golongan Proton Pump Inhibitor (PPI) untuk mengurangi produksi asam lambung, mengatasi GERD dan tukak lambung</w:t>
+            </w:r>
+          </w:p>
+        </w:tc>
+        <w:tc>
+          <w:tcPr>
+            <w:tcW w:w="894" w:type="dxa"/>
+            <w:hideMark/>
+          </w:tcPr>
+          <w:p>
+            <w:pPr>
+              <w:spacing w:after="160"/>
+              <w:rPr>
+                <w:rFonts w:ascii="Times New Roman" w:hAnsi="Times New Roman" w:cs="Times New Roman"/>
+                <w:sz w:val="20"/>
+                <w:szCs w:val="20"/>
+                <w:lang w:val="en-US"/>
+              </w:rPr>
+            </w:pPr>
+            <w:r>
+              <w:rPr>
+                <w:rFonts w:ascii="Times New Roman" w:hAnsi="Times New Roman" w:cs="Times New Roman"/>
+                <w:sz w:val="20"/>
+                <w:szCs w:val="20"/>
+                <w:lang w:val="en-US"/>
+              </w:rPr>
+              <w:t>Lonjong</w:t>
+            </w:r>
+          </w:p>
+        </w:tc>
+        <w:tc>
+          <w:tcPr>
+            <w:tcW w:w="807" w:type="dxa"/>
+            <w:hideMark/>
+          </w:tcPr>
+          <w:p>
+            <w:pPr>
+              <w:spacing w:after="160"/>
+              <w:rPr>
+                <w:rFonts w:ascii="Times New Roman" w:hAnsi="Times New Roman" w:cs="Times New Roman"/>
+                <w:sz w:val="20"/>
+                <w:szCs w:val="20"/>
+                <w:lang w:val="en-US"/>
+              </w:rPr>
+            </w:pPr>
+            <w:r>
+              <w:rPr>
+                <w:rFonts w:ascii="Times New Roman" w:hAnsi="Times New Roman" w:cs="Times New Roman"/>
+                <w:sz w:val="20"/>
+                <w:szCs w:val="20"/>
+                <w:lang w:val="en-US"/>
+              </w:rPr>
+              <w:t>Kuning</w:t>
+            </w:r>
+          </w:p>
+        </w:tc>
+        <w:tc>
+          <w:tcPr>
+            <w:tcW w:w="928" w:type="dxa"/>
+            <w:hideMark/>
+          </w:tcPr>
+          <w:p>
+            <w:pPr>
+              <w:spacing w:after="160"/>
+              <w:rPr>
+                <w:rFonts w:ascii="Times New Roman" w:hAnsi="Times New Roman" w:cs="Times New Roman"/>
+                <w:sz w:val="20"/>
+                <w:szCs w:val="20"/>
+                <w:lang w:val="en-US"/>
+              </w:rPr>
+            </w:pPr>
+            <w:r>
+              <w:rPr>
+                <w:rFonts w:ascii="Times New Roman" w:hAnsi="Times New Roman" w:cs="Times New Roman"/>
+                <w:sz w:val="20"/>
+                <w:szCs w:val="20"/>
+                <w:lang w:val="en-US"/>
+              </w:rPr>
+              <w:t>Polos</w:t>
+            </w:r>
+          </w:p>
+        </w:tc>
+        <w:tc>
+          <w:tcPr>
+            <w:tcW w:w="961" w:type="dxa"/>
+            <w:hideMark/>
+          </w:tcPr>
+          <w:p>
+            <w:pPr>
+              <w:spacing w:after="160"/>
+              <w:rPr>
+                <w:rFonts w:ascii="Times New Roman" w:hAnsi="Times New Roman" w:cs="Times New Roman"/>
+                <w:sz w:val="20"/>
+                <w:szCs w:val="20"/>
+                <w:lang w:val="en-US"/>
+              </w:rPr>
+            </w:pPr>
+            <w:r>
+              <w:rPr>
+                <w:rFonts w:ascii="Segoe UI Emoji" w:hAnsi="Segoe UI Emoji" w:cs="Segoe UI Emoji"/>
+                <w:sz w:val="20"/>
+                <w:szCs w:val="20"/>
+                <w:lang w:val="en-US"/>
+              </w:rPr>
+              <w:t>✅</w:t>
+            </w:r>
+            <w:r>
+              <w:rPr>
+                <w:rFonts w:ascii="Times New Roman" w:hAnsi="Times New Roman" w:cs="Times New Roman"/>
+                <w:sz w:val="20"/>
+                <w:szCs w:val="20"/>
+                <w:lang w:val="en-US"/>
+              </w:rPr>
+              <w:t xml:space="preserve"> Ada</w:t>
+            </w:r>
+          </w:p>
+        </w:tc>
+        <w:tc>
+          <w:tcPr>
+            <w:tcW w:w="1355" w:type="dxa"/>
+            <w:hideMark/>
+          </w:tcPr>
+          <w:p>
+            <w:pPr>
+              <w:spacing w:after="160"/>
+              <w:rPr>
+                <w:rFonts w:ascii="Times New Roman" w:hAnsi="Times New Roman" w:cs="Times New Roman"/>
+                <w:sz w:val="20"/>
+                <w:szCs w:val="20"/>
+                <w:lang w:val="en-US"/>
+              </w:rPr>
+            </w:pPr>
+            <w:r>
+              <w:rPr>
+                <w:rFonts w:ascii="Times New Roman" w:hAnsi="Times New Roman" w:cs="Times New Roman"/>
+                <w:sz w:val="20"/>
+                <w:szCs w:val="20"/>
+                <w:lang w:val="en-US"/>
+              </w:rPr>
+              <w:t>pantoprazol_sandoz_40_mg</w:t>
+            </w:r>
+          </w:p>
+        </w:tc>
+        <w:tc>
+          <w:tcPr>
+            <w:tcW w:w="1275" w:type="dxa"/>
+            <w:hideMark/>
+          </w:tcPr>
+          <w:p>
+            <w:pPr>
+              <w:spacing w:after="160"/>
+              <w:rPr>
+                <w:rFonts w:ascii="Times New Roman" w:hAnsi="Times New Roman" w:cs="Times New Roman"/>
+                <w:sz w:val="20"/>
+                <w:szCs w:val="20"/>
+                <w:lang w:val="en-US"/>
+              </w:rPr>
+            </w:pPr>
+            <w:r>
+              <w:rPr>
+                <w:rFonts w:ascii="Times New Roman" w:hAnsi="Times New Roman" w:cs="Times New Roman"/>
+                <w:sz w:val="20"/>
+                <w:szCs w:val="20"/>
+                <w:lang w:val="en-US"/>
+              </w:rPr>
+              <w:t>Bisa dipakai</w:t>
             </w:r>
           </w:p>
         </w:tc>
@@ -11071,7 +11644,7 @@
       <w:tr>
         <w:tc>
           <w:tcPr>
-            <w:tcW w:w="0" w:type="auto"/>
+            <w:tcW w:w="461" w:type="dxa"/>
             <w:hideMark/>
           </w:tcPr>
           <w:p>
@@ -11097,7 +11670,7 @@
         </w:tc>
         <w:tc>
           <w:tcPr>
-            <w:tcW w:w="3220" w:type="dxa"/>
+            <w:tcW w:w="1094" w:type="dxa"/>
             <w:hideMark/>
           </w:tcPr>
           <w:p>
@@ -11117,13 +11690,13 @@
                 <w:szCs w:val="20"/>
                 <w:lang w:val="en-US"/>
               </w:rPr>
-              <w:t>Vitamin C</w:t>
+              <w:t>C Vitamin Teva 500 mg</w:t>
             </w:r>
           </w:p>
         </w:tc>
         <w:tc>
           <w:tcPr>
-            <w:tcW w:w="5528" w:type="dxa"/>
+            <w:tcW w:w="1701" w:type="dxa"/>
             <w:hideMark/>
           </w:tcPr>
           <w:p>
@@ -11143,7 +11716,183 @@
                 <w:szCs w:val="20"/>
                 <w:lang w:val="en-US"/>
               </w:rPr>
-              <w:t>vita_c</w:t>
+              <w:t xml:space="preserve">Suplemen vitamin C untuk membantu memenuhi kebutuhan vitamin C dan </w:t>
+            </w:r>
+            <w:r>
+              <w:rPr>
+                <w:rFonts w:ascii="Times New Roman" w:hAnsi="Times New Roman" w:cs="Times New Roman"/>
+                <w:sz w:val="20"/>
+                <w:szCs w:val="20"/>
+                <w:lang w:val="en-US"/>
+              </w:rPr>
+              <w:lastRenderedPageBreak/>
+              <w:t>menjaga daya tahan tubuh</w:t>
+            </w:r>
+          </w:p>
+        </w:tc>
+        <w:tc>
+          <w:tcPr>
+            <w:tcW w:w="894" w:type="dxa"/>
+            <w:hideMark/>
+          </w:tcPr>
+          <w:p>
+            <w:pPr>
+              <w:spacing w:after="160"/>
+              <w:rPr>
+                <w:rFonts w:ascii="Times New Roman" w:hAnsi="Times New Roman" w:cs="Times New Roman"/>
+                <w:sz w:val="20"/>
+                <w:szCs w:val="20"/>
+                <w:lang w:val="en-US"/>
+              </w:rPr>
+            </w:pPr>
+            <w:r>
+              <w:rPr>
+                <w:rFonts w:ascii="Times New Roman" w:hAnsi="Times New Roman" w:cs="Times New Roman"/>
+                <w:sz w:val="20"/>
+                <w:szCs w:val="20"/>
+                <w:lang w:val="en-US"/>
+              </w:rPr>
+              <w:lastRenderedPageBreak/>
+              <w:t>Bulat</w:t>
+            </w:r>
+          </w:p>
+        </w:tc>
+        <w:tc>
+          <w:tcPr>
+            <w:tcW w:w="807" w:type="dxa"/>
+            <w:hideMark/>
+          </w:tcPr>
+          <w:p>
+            <w:pPr>
+              <w:spacing w:after="160"/>
+              <w:rPr>
+                <w:rFonts w:ascii="Times New Roman" w:hAnsi="Times New Roman" w:cs="Times New Roman"/>
+                <w:sz w:val="20"/>
+                <w:szCs w:val="20"/>
+                <w:lang w:val="en-US"/>
+              </w:rPr>
+            </w:pPr>
+            <w:r>
+              <w:rPr>
+                <w:rFonts w:ascii="Times New Roman" w:hAnsi="Times New Roman" w:cs="Times New Roman"/>
+                <w:sz w:val="20"/>
+                <w:szCs w:val="20"/>
+                <w:lang w:val="en-US"/>
+              </w:rPr>
+              <w:t>Oranye</w:t>
+            </w:r>
+          </w:p>
+        </w:tc>
+        <w:tc>
+          <w:tcPr>
+            <w:tcW w:w="928" w:type="dxa"/>
+            <w:hideMark/>
+          </w:tcPr>
+          <w:p>
+            <w:pPr>
+              <w:spacing w:after="160"/>
+              <w:rPr>
+                <w:rFonts w:ascii="Times New Roman" w:hAnsi="Times New Roman" w:cs="Times New Roman"/>
+                <w:sz w:val="20"/>
+                <w:szCs w:val="20"/>
+                <w:lang w:val="en-US"/>
+              </w:rPr>
+            </w:pPr>
+            <w:r>
+              <w:rPr>
+                <w:rFonts w:ascii="Times New Roman" w:hAnsi="Times New Roman" w:cs="Times New Roman"/>
+                <w:sz w:val="20"/>
+                <w:szCs w:val="20"/>
+                <w:lang w:val="en-US"/>
+              </w:rPr>
+              <w:t>Polos</w:t>
+            </w:r>
+          </w:p>
+        </w:tc>
+        <w:tc>
+          <w:tcPr>
+            <w:tcW w:w="961" w:type="dxa"/>
+            <w:hideMark/>
+          </w:tcPr>
+          <w:p>
+            <w:pPr>
+              <w:spacing w:after="160"/>
+              <w:rPr>
+                <w:rFonts w:ascii="Times New Roman" w:hAnsi="Times New Roman" w:cs="Times New Roman"/>
+                <w:sz w:val="20"/>
+                <w:szCs w:val="20"/>
+                <w:lang w:val="en-US"/>
+              </w:rPr>
+            </w:pPr>
+            <w:r>
+              <w:rPr>
+                <w:rFonts w:ascii="Segoe UI Emoji" w:hAnsi="Segoe UI Emoji" w:cs="Segoe UI Emoji"/>
+                <w:sz w:val="20"/>
+                <w:szCs w:val="20"/>
+                <w:lang w:val="en-US"/>
+              </w:rPr>
+              <w:t>✅</w:t>
+            </w:r>
+            <w:r>
+              <w:rPr>
+                <w:rFonts w:ascii="Times New Roman" w:hAnsi="Times New Roman" w:cs="Times New Roman"/>
+                <w:sz w:val="20"/>
+                <w:szCs w:val="20"/>
+                <w:lang w:val="en-US"/>
+              </w:rPr>
+              <w:t xml:space="preserve"> Ada</w:t>
+            </w:r>
+          </w:p>
+        </w:tc>
+        <w:tc>
+          <w:tcPr>
+            <w:tcW w:w="1355" w:type="dxa"/>
+            <w:hideMark/>
+          </w:tcPr>
+          <w:p>
+            <w:pPr>
+              <w:spacing w:after="160"/>
+              <w:rPr>
+                <w:rFonts w:ascii="Times New Roman" w:hAnsi="Times New Roman" w:cs="Times New Roman"/>
+                <w:sz w:val="20"/>
+                <w:szCs w:val="20"/>
+                <w:lang w:val="en-US"/>
+              </w:rPr>
+            </w:pPr>
+            <w:r>
+              <w:rPr>
+                <w:rFonts w:ascii="Times New Roman" w:hAnsi="Times New Roman" w:cs="Times New Roman"/>
+                <w:sz w:val="20"/>
+                <w:szCs w:val="20"/>
+                <w:lang w:val="en-US"/>
+              </w:rPr>
+              <w:t>c_vitamin_teva_500_mg</w:t>
+            </w:r>
+          </w:p>
+        </w:tc>
+        <w:tc>
+          <w:tcPr>
+            <w:tcW w:w="1275" w:type="dxa"/>
+            <w:hideMark/>
+          </w:tcPr>
+          <w:p>
+            <w:pPr>
+              <w:spacing w:after="160"/>
+              <w:rPr>
+                <w:rFonts w:ascii="Times New Roman" w:hAnsi="Times New Roman" w:cs="Times New Roman"/>
+                <w:sz w:val="20"/>
+                <w:szCs w:val="20"/>
+                <w:lang w:val="en-US"/>
+              </w:rPr>
+            </w:pPr>
+            <w:r>
+              <w:rPr>
+                <w:rFonts w:ascii="Times New Roman" w:hAnsi="Times New Roman" w:cs="Times New Roman"/>
+                <w:sz w:val="20"/>
+                <w:szCs w:val="20"/>
+                <w:lang w:val="en-US"/>
+              </w:rPr>
+              <w:t>Bisa dipakai</w:t>
             </w:r>
           </w:p>
         </w:tc>
@@ -11151,7 +11900,7 @@
       <w:tr>
         <w:tc>
           <w:tcPr>
-            <w:tcW w:w="0" w:type="auto"/>
+            <w:tcW w:w="461" w:type="dxa"/>
             <w:hideMark/>
           </w:tcPr>
           <w:p>
@@ -11177,7 +11926,7 @@
         </w:tc>
         <w:tc>
           <w:tcPr>
-            <w:tcW w:w="3220" w:type="dxa"/>
+            <w:tcW w:w="1094" w:type="dxa"/>
             <w:hideMark/>
           </w:tcPr>
           <w:p>
@@ -11197,13 +11946,13 @@
                 <w:szCs w:val="20"/>
                 <w:lang w:val="en-US"/>
               </w:rPr>
-              <w:t>Aspirin</w:t>
+              <w:t>Aspirin Ultra 500 mg</w:t>
             </w:r>
           </w:p>
         </w:tc>
         <w:tc>
           <w:tcPr>
-            <w:tcW w:w="5528" w:type="dxa"/>
+            <w:tcW w:w="1701" w:type="dxa"/>
             <w:hideMark/>
           </w:tcPr>
           <w:p>
@@ -11223,7 +11972,172 @@
                 <w:szCs w:val="20"/>
                 <w:lang w:val="en-US"/>
               </w:rPr>
+              <w:t>Analgesik untuk meredakan nyeri dan demam serta memiliki efek antiplatelet pada dosis tertentu</w:t>
+            </w:r>
+          </w:p>
+        </w:tc>
+        <w:tc>
+          <w:tcPr>
+            <w:tcW w:w="894" w:type="dxa"/>
+            <w:hideMark/>
+          </w:tcPr>
+          <w:p>
+            <w:pPr>
+              <w:spacing w:after="160"/>
+              <w:rPr>
+                <w:rFonts w:ascii="Times New Roman" w:hAnsi="Times New Roman" w:cs="Times New Roman"/>
+                <w:sz w:val="20"/>
+                <w:szCs w:val="20"/>
+                <w:lang w:val="en-US"/>
+              </w:rPr>
+            </w:pPr>
+            <w:r>
+              <w:rPr>
+                <w:rFonts w:ascii="Times New Roman" w:hAnsi="Times New Roman" w:cs="Times New Roman"/>
+                <w:sz w:val="20"/>
+                <w:szCs w:val="20"/>
+                <w:lang w:val="en-US"/>
+              </w:rPr>
+              <w:t>Bulat</w:t>
+            </w:r>
+          </w:p>
+        </w:tc>
+        <w:tc>
+          <w:tcPr>
+            <w:tcW w:w="807" w:type="dxa"/>
+            <w:hideMark/>
+          </w:tcPr>
+          <w:p>
+            <w:pPr>
+              <w:spacing w:after="160"/>
+              <w:rPr>
+                <w:rFonts w:ascii="Times New Roman" w:hAnsi="Times New Roman" w:cs="Times New Roman"/>
+                <w:sz w:val="20"/>
+                <w:szCs w:val="20"/>
+                <w:lang w:val="en-US"/>
+              </w:rPr>
+            </w:pPr>
+            <w:r>
+              <w:rPr>
+                <w:rFonts w:ascii="Times New Roman" w:hAnsi="Times New Roman" w:cs="Times New Roman"/>
+                <w:sz w:val="20"/>
+                <w:szCs w:val="20"/>
+                <w:lang w:val="en-US"/>
+              </w:rPr>
+              <w:t>Putih</w:t>
+            </w:r>
+          </w:p>
+        </w:tc>
+        <w:tc>
+          <w:tcPr>
+            <w:tcW w:w="928" w:type="dxa"/>
+            <w:hideMark/>
+          </w:tcPr>
+          <w:p>
+            <w:pPr>
+              <w:spacing w:after="160"/>
+              <w:rPr>
+                <w:rFonts w:ascii="Times New Roman" w:hAnsi="Times New Roman" w:cs="Times New Roman"/>
+                <w:sz w:val="20"/>
+                <w:szCs w:val="20"/>
+                <w:lang w:val="en-US"/>
+              </w:rPr>
+            </w:pPr>
+            <w:r>
+              <w:rPr>
+                <w:rFonts w:ascii="Times New Roman" w:hAnsi="Times New Roman" w:cs="Times New Roman"/>
+                <w:sz w:val="20"/>
+                <w:szCs w:val="20"/>
+                <w:lang w:val="en-US"/>
+              </w:rPr>
+              <w:t>BA500 dan BAYER</w:t>
+            </w:r>
+          </w:p>
+        </w:tc>
+        <w:tc>
+          <w:tcPr>
+            <w:tcW w:w="961" w:type="dxa"/>
+            <w:hideMark/>
+          </w:tcPr>
+          <w:p>
+            <w:pPr>
+              <w:spacing w:after="160"/>
+              <w:rPr>
+                <w:rFonts w:ascii="Times New Roman" w:hAnsi="Times New Roman" w:cs="Times New Roman"/>
+                <w:sz w:val="20"/>
+                <w:szCs w:val="20"/>
+                <w:lang w:val="en-US"/>
+              </w:rPr>
+            </w:pPr>
+            <w:r>
+              <w:rPr>
+                <w:rFonts w:ascii="Segoe UI Emoji" w:hAnsi="Segoe UI Emoji" w:cs="Segoe UI Emoji"/>
+                <w:sz w:val="20"/>
+                <w:szCs w:val="20"/>
+                <w:lang w:val="en-US"/>
+              </w:rPr>
+              <w:t>✅</w:t>
+            </w:r>
+            <w:r>
+              <w:rPr>
+                <w:rFonts w:ascii="Times New Roman" w:hAnsi="Times New Roman" w:cs="Times New Roman"/>
+                <w:sz w:val="20"/>
+                <w:szCs w:val="20"/>
+                <w:lang w:val="en-US"/>
+              </w:rPr>
+              <w:t xml:space="preserve"> Ada</w:t>
+            </w:r>
+          </w:p>
+        </w:tc>
+        <w:tc>
+          <w:tcPr>
+            <w:tcW w:w="1355" w:type="dxa"/>
+            <w:hideMark/>
+          </w:tcPr>
+          <w:p>
+            <w:pPr>
+              <w:spacing w:after="160"/>
+              <w:rPr>
+                <w:rFonts w:ascii="Times New Roman" w:hAnsi="Times New Roman" w:cs="Times New Roman"/>
+                <w:sz w:val="20"/>
+                <w:szCs w:val="20"/>
+                <w:lang w:val="en-US"/>
+              </w:rPr>
+            </w:pPr>
+            <w:r>
+              <w:rPr>
+                <w:rFonts w:ascii="Times New Roman" w:hAnsi="Times New Roman" w:cs="Times New Roman"/>
+                <w:sz w:val="20"/>
+                <w:szCs w:val="20"/>
+                <w:lang w:val="en-US"/>
+              </w:rPr>
               <w:t>aspirin_ultra_500_mg</w:t>
+            </w:r>
+          </w:p>
+        </w:tc>
+        <w:tc>
+          <w:tcPr>
+            <w:tcW w:w="1275" w:type="dxa"/>
+            <w:hideMark/>
+          </w:tcPr>
+          <w:p>
+            <w:pPr>
+              <w:spacing w:after="160"/>
+              <w:rPr>
+                <w:rFonts w:ascii="Times New Roman" w:hAnsi="Times New Roman" w:cs="Times New Roman"/>
+                <w:sz w:val="20"/>
+                <w:szCs w:val="20"/>
+                <w:lang w:val="en-US"/>
+              </w:rPr>
+            </w:pPr>
+            <w:r>
+              <w:rPr>
+                <w:rFonts w:ascii="Times New Roman" w:hAnsi="Times New Roman" w:cs="Times New Roman"/>
+                <w:sz w:val="20"/>
+                <w:szCs w:val="20"/>
+                <w:lang w:val="en-US"/>
+              </w:rPr>
+              <w:t>Bisa dipakai</w:t>
             </w:r>
           </w:p>
         </w:tc>
@@ -11231,7 +12145,7 @@
       <w:tr>
         <w:tc>
           <w:tcPr>
-            <w:tcW w:w="0" w:type="auto"/>
+            <w:tcW w:w="461" w:type="dxa"/>
             <w:hideMark/>
           </w:tcPr>
           <w:p>
@@ -11257,7 +12171,7 @@
         </w:tc>
         <w:tc>
           <w:tcPr>
-            <w:tcW w:w="3220" w:type="dxa"/>
+            <w:tcW w:w="1094" w:type="dxa"/>
             <w:hideMark/>
           </w:tcPr>
           <w:p>
@@ -11277,13 +12191,13 @@
                 <w:szCs w:val="20"/>
                 <w:lang w:val="en-US"/>
               </w:rPr>
-              <w:t>Ibuprofen</w:t>
+              <w:t>Algoflex Forte Dolo 400 mg</w:t>
             </w:r>
           </w:p>
         </w:tc>
         <w:tc>
           <w:tcPr>
-            <w:tcW w:w="5528" w:type="dxa"/>
+            <w:tcW w:w="1701" w:type="dxa"/>
             <w:hideMark/>
           </w:tcPr>
           <w:p>
@@ -11303,7 +12217,172 @@
                 <w:szCs w:val="20"/>
                 <w:lang w:val="en-US"/>
               </w:rPr>
-              <w:t>ibumax_400_mg</w:t>
+              <w:t>Anti-nyeri dan anti-inflamasi (NSAID) dengan kandungan ibuprofen untuk mengatasi nyeri dan peradangan</w:t>
+            </w:r>
+          </w:p>
+        </w:tc>
+        <w:tc>
+          <w:tcPr>
+            <w:tcW w:w="894" w:type="dxa"/>
+            <w:hideMark/>
+          </w:tcPr>
+          <w:p>
+            <w:pPr>
+              <w:spacing w:after="160"/>
+              <w:rPr>
+                <w:rFonts w:ascii="Times New Roman" w:hAnsi="Times New Roman" w:cs="Times New Roman"/>
+                <w:sz w:val="20"/>
+                <w:szCs w:val="20"/>
+                <w:lang w:val="en-US"/>
+              </w:rPr>
+            </w:pPr>
+            <w:r>
+              <w:rPr>
+                <w:rFonts w:ascii="Times New Roman" w:hAnsi="Times New Roman" w:cs="Times New Roman"/>
+                <w:sz w:val="20"/>
+                <w:szCs w:val="20"/>
+                <w:lang w:val="en-US"/>
+              </w:rPr>
+              <w:t>Oval</w:t>
+            </w:r>
+          </w:p>
+        </w:tc>
+        <w:tc>
+          <w:tcPr>
+            <w:tcW w:w="807" w:type="dxa"/>
+            <w:hideMark/>
+          </w:tcPr>
+          <w:p>
+            <w:pPr>
+              <w:spacing w:after="160"/>
+              <w:rPr>
+                <w:rFonts w:ascii="Times New Roman" w:hAnsi="Times New Roman" w:cs="Times New Roman"/>
+                <w:sz w:val="20"/>
+                <w:szCs w:val="20"/>
+                <w:lang w:val="en-US"/>
+              </w:rPr>
+            </w:pPr>
+            <w:r>
+              <w:rPr>
+                <w:rFonts w:ascii="Times New Roman" w:hAnsi="Times New Roman" w:cs="Times New Roman"/>
+                <w:sz w:val="20"/>
+                <w:szCs w:val="20"/>
+                <w:lang w:val="en-US"/>
+              </w:rPr>
+              <w:t>Merah muda/Pink</w:t>
+            </w:r>
+          </w:p>
+        </w:tc>
+        <w:tc>
+          <w:tcPr>
+            <w:tcW w:w="928" w:type="dxa"/>
+            <w:hideMark/>
+          </w:tcPr>
+          <w:p>
+            <w:pPr>
+              <w:spacing w:after="160"/>
+              <w:rPr>
+                <w:rFonts w:ascii="Times New Roman" w:hAnsi="Times New Roman" w:cs="Times New Roman"/>
+                <w:sz w:val="20"/>
+                <w:szCs w:val="20"/>
+                <w:lang w:val="en-US"/>
+              </w:rPr>
+            </w:pPr>
+            <w:r>
+              <w:rPr>
+                <w:rFonts w:ascii="Times New Roman" w:hAnsi="Times New Roman" w:cs="Times New Roman"/>
+                <w:sz w:val="20"/>
+                <w:szCs w:val="20"/>
+                <w:lang w:val="en-US"/>
+              </w:rPr>
+              <w:t>Bergaris</w:t>
+            </w:r>
+          </w:p>
+        </w:tc>
+        <w:tc>
+          <w:tcPr>
+            <w:tcW w:w="961" w:type="dxa"/>
+            <w:hideMark/>
+          </w:tcPr>
+          <w:p>
+            <w:pPr>
+              <w:spacing w:after="160"/>
+              <w:rPr>
+                <w:rFonts w:ascii="Times New Roman" w:hAnsi="Times New Roman" w:cs="Times New Roman"/>
+                <w:sz w:val="20"/>
+                <w:szCs w:val="20"/>
+                <w:lang w:val="en-US"/>
+              </w:rPr>
+            </w:pPr>
+            <w:r>
+              <w:rPr>
+                <w:rFonts w:ascii="Segoe UI Emoji" w:hAnsi="Segoe UI Emoji" w:cs="Segoe UI Emoji"/>
+                <w:sz w:val="20"/>
+                <w:szCs w:val="20"/>
+                <w:lang w:val="en-US"/>
+              </w:rPr>
+              <w:t>✅</w:t>
+            </w:r>
+            <w:r>
+              <w:rPr>
+                <w:rFonts w:ascii="Times New Roman" w:hAnsi="Times New Roman" w:cs="Times New Roman"/>
+                <w:sz w:val="20"/>
+                <w:szCs w:val="20"/>
+                <w:lang w:val="en-US"/>
+              </w:rPr>
+              <w:t xml:space="preserve"> Ada</w:t>
+            </w:r>
+          </w:p>
+        </w:tc>
+        <w:tc>
+          <w:tcPr>
+            <w:tcW w:w="1355" w:type="dxa"/>
+            <w:hideMark/>
+          </w:tcPr>
+          <w:p>
+            <w:pPr>
+              <w:spacing w:after="160"/>
+              <w:rPr>
+                <w:rFonts w:ascii="Times New Roman" w:hAnsi="Times New Roman" w:cs="Times New Roman"/>
+                <w:sz w:val="20"/>
+                <w:szCs w:val="20"/>
+                <w:lang w:val="en-US"/>
+              </w:rPr>
+            </w:pPr>
+            <w:r>
+              <w:rPr>
+                <w:rFonts w:ascii="Times New Roman" w:hAnsi="Times New Roman" w:cs="Times New Roman"/>
+                <w:sz w:val="20"/>
+                <w:szCs w:val="20"/>
+                <w:lang w:val="en-US"/>
+              </w:rPr>
+              <w:t>algoflex_forte_dolo_400_mg</w:t>
+            </w:r>
+          </w:p>
+        </w:tc>
+        <w:tc>
+          <w:tcPr>
+            <w:tcW w:w="1275" w:type="dxa"/>
+            <w:hideMark/>
+          </w:tcPr>
+          <w:p>
+            <w:pPr>
+              <w:spacing w:after="160"/>
+              <w:rPr>
+                <w:rFonts w:ascii="Times New Roman" w:hAnsi="Times New Roman" w:cs="Times New Roman"/>
+                <w:sz w:val="20"/>
+                <w:szCs w:val="20"/>
+                <w:lang w:val="en-US"/>
+              </w:rPr>
+            </w:pPr>
+            <w:r>
+              <w:rPr>
+                <w:rFonts w:ascii="Times New Roman" w:hAnsi="Times New Roman" w:cs="Times New Roman"/>
+                <w:sz w:val="20"/>
+                <w:szCs w:val="20"/>
+                <w:lang w:val="en-US"/>
+              </w:rPr>
+              <w:t>Bisa dipakai</w:t>
             </w:r>
           </w:p>
         </w:tc>
@@ -11311,7 +12390,7 @@
       <w:tr>
         <w:tc>
           <w:tcPr>
-            <w:tcW w:w="0" w:type="auto"/>
+            <w:tcW w:w="461" w:type="dxa"/>
             <w:hideMark/>
           </w:tcPr>
           <w:p>
@@ -11337,7 +12416,7 @@
         </w:tc>
         <w:tc>
           <w:tcPr>
-            <w:tcW w:w="3220" w:type="dxa"/>
+            <w:tcW w:w="1094" w:type="dxa"/>
             <w:hideMark/>
           </w:tcPr>
           <w:p>
@@ -11357,13 +12436,13 @@
                 <w:szCs w:val="20"/>
                 <w:lang w:val="en-US"/>
               </w:rPr>
-              <w:t>Metformin</w:t>
+              <w:t>Merckformin XR 1000 mg</w:t>
             </w:r>
           </w:p>
         </w:tc>
         <w:tc>
           <w:tcPr>
-            <w:tcW w:w="5528" w:type="dxa"/>
+            <w:tcW w:w="1701" w:type="dxa"/>
             <w:hideMark/>
           </w:tcPr>
           <w:p>
@@ -11383,7 +12462,172 @@
                 <w:szCs w:val="20"/>
                 <w:lang w:val="en-US"/>
               </w:rPr>
+              <w:t>Antidiabetes oral dengan kandungan metformin untuk membantu mengontrol kadar gula darah pada diabetes tipe 2</w:t>
+            </w:r>
+          </w:p>
+        </w:tc>
+        <w:tc>
+          <w:tcPr>
+            <w:tcW w:w="894" w:type="dxa"/>
+            <w:hideMark/>
+          </w:tcPr>
+          <w:p>
+            <w:pPr>
+              <w:spacing w:after="160"/>
+              <w:rPr>
+                <w:rFonts w:ascii="Times New Roman" w:hAnsi="Times New Roman" w:cs="Times New Roman"/>
+                <w:sz w:val="20"/>
+                <w:szCs w:val="20"/>
+                <w:lang w:val="en-US"/>
+              </w:rPr>
+            </w:pPr>
+            <w:r>
+              <w:rPr>
+                <w:rFonts w:ascii="Times New Roman" w:hAnsi="Times New Roman" w:cs="Times New Roman"/>
+                <w:sz w:val="20"/>
+                <w:szCs w:val="20"/>
+                <w:lang w:val="en-US"/>
+              </w:rPr>
+              <w:t>Oval</w:t>
+            </w:r>
+          </w:p>
+        </w:tc>
+        <w:tc>
+          <w:tcPr>
+            <w:tcW w:w="807" w:type="dxa"/>
+            <w:hideMark/>
+          </w:tcPr>
+          <w:p>
+            <w:pPr>
+              <w:spacing w:after="160"/>
+              <w:rPr>
+                <w:rFonts w:ascii="Times New Roman" w:hAnsi="Times New Roman" w:cs="Times New Roman"/>
+                <w:sz w:val="20"/>
+                <w:szCs w:val="20"/>
+                <w:lang w:val="en-US"/>
+              </w:rPr>
+            </w:pPr>
+            <w:r>
+              <w:rPr>
+                <w:rFonts w:ascii="Times New Roman" w:hAnsi="Times New Roman" w:cs="Times New Roman"/>
+                <w:sz w:val="20"/>
+                <w:szCs w:val="20"/>
+                <w:lang w:val="en-US"/>
+              </w:rPr>
+              <w:t>Putih</w:t>
+            </w:r>
+          </w:p>
+        </w:tc>
+        <w:tc>
+          <w:tcPr>
+            <w:tcW w:w="928" w:type="dxa"/>
+            <w:hideMark/>
+          </w:tcPr>
+          <w:p>
+            <w:pPr>
+              <w:spacing w:after="160"/>
+              <w:rPr>
+                <w:rFonts w:ascii="Times New Roman" w:hAnsi="Times New Roman" w:cs="Times New Roman"/>
+                <w:sz w:val="20"/>
+                <w:szCs w:val="20"/>
+                <w:lang w:val="en-US"/>
+              </w:rPr>
+            </w:pPr>
+            <w:r>
+              <w:rPr>
+                <w:rFonts w:ascii="Times New Roman" w:hAnsi="Times New Roman" w:cs="Times New Roman"/>
+                <w:sz w:val="20"/>
+                <w:szCs w:val="20"/>
+                <w:lang w:val="en-US"/>
+              </w:rPr>
+              <w:t>1000 dan MERCK</w:t>
+            </w:r>
+          </w:p>
+        </w:tc>
+        <w:tc>
+          <w:tcPr>
+            <w:tcW w:w="961" w:type="dxa"/>
+            <w:hideMark/>
+          </w:tcPr>
+          <w:p>
+            <w:pPr>
+              <w:spacing w:after="160"/>
+              <w:rPr>
+                <w:rFonts w:ascii="Times New Roman" w:hAnsi="Times New Roman" w:cs="Times New Roman"/>
+                <w:sz w:val="20"/>
+                <w:szCs w:val="20"/>
+                <w:lang w:val="en-US"/>
+              </w:rPr>
+            </w:pPr>
+            <w:r>
+              <w:rPr>
+                <w:rFonts w:ascii="Segoe UI Emoji" w:hAnsi="Segoe UI Emoji" w:cs="Segoe UI Emoji"/>
+                <w:sz w:val="20"/>
+                <w:szCs w:val="20"/>
+                <w:lang w:val="en-US"/>
+              </w:rPr>
+              <w:t>✅</w:t>
+            </w:r>
+            <w:r>
+              <w:rPr>
+                <w:rFonts w:ascii="Times New Roman" w:hAnsi="Times New Roman" w:cs="Times New Roman"/>
+                <w:sz w:val="20"/>
+                <w:szCs w:val="20"/>
+                <w:lang w:val="en-US"/>
+              </w:rPr>
+              <w:t xml:space="preserve"> Ada</w:t>
+            </w:r>
+          </w:p>
+        </w:tc>
+        <w:tc>
+          <w:tcPr>
+            <w:tcW w:w="1355" w:type="dxa"/>
+            <w:hideMark/>
+          </w:tcPr>
+          <w:p>
+            <w:pPr>
+              <w:spacing w:after="160"/>
+              <w:rPr>
+                <w:rFonts w:ascii="Times New Roman" w:hAnsi="Times New Roman" w:cs="Times New Roman"/>
+                <w:sz w:val="20"/>
+                <w:szCs w:val="20"/>
+                <w:lang w:val="en-US"/>
+              </w:rPr>
+            </w:pPr>
+            <w:r>
+              <w:rPr>
+                <w:rFonts w:ascii="Times New Roman" w:hAnsi="Times New Roman" w:cs="Times New Roman"/>
+                <w:sz w:val="20"/>
+                <w:szCs w:val="20"/>
+                <w:lang w:val="en-US"/>
+              </w:rPr>
               <w:t>merckformin_xr_1000_mg</w:t>
+            </w:r>
+          </w:p>
+        </w:tc>
+        <w:tc>
+          <w:tcPr>
+            <w:tcW w:w="1275" w:type="dxa"/>
+            <w:hideMark/>
+          </w:tcPr>
+          <w:p>
+            <w:pPr>
+              <w:spacing w:after="160"/>
+              <w:rPr>
+                <w:rFonts w:ascii="Times New Roman" w:hAnsi="Times New Roman" w:cs="Times New Roman"/>
+                <w:sz w:val="20"/>
+                <w:szCs w:val="20"/>
+                <w:lang w:val="en-US"/>
+              </w:rPr>
+            </w:pPr>
+            <w:r>
+              <w:rPr>
+                <w:rFonts w:ascii="Times New Roman" w:hAnsi="Times New Roman" w:cs="Times New Roman"/>
+                <w:sz w:val="20"/>
+                <w:szCs w:val="20"/>
+                <w:lang w:val="en-US"/>
+              </w:rPr>
+              <w:t>Bisa dipakai</w:t>
             </w:r>
           </w:p>
         </w:tc>

</xml_diff>